<commit_message>
nice closed form functions
</commit_message>
<xml_diff>
--- a/hjb_ladder_purpose.docx
+++ b/hjb_ladder_purpose.docx
@@ -475,16 +475,7 @@
         <w:spacing w:after="160"/>
       </w:pPr>
       <w:r>
-        <w:t xml:space="preserve">A pricing model that cannot keep up with the market is of limited use. The solver is implemented in C++ and typically converges in </w:t>
-      </w:r>
-      <w:r>
-        <w:rPr>
-          <w:b/>
-        </w:rPr>
-        <w:t>under a second</w:t>
-      </w:r>
-      <w:r>
-        <w:t>, which means the entire quote ladder — all sizes, all inventory levels, bid and ask — can be recomputed from scratch as conditions evolve.</w:t>
+        <w:t>A pricing model that cannot keep up with the market is of limited use. The solver is implemented in pure Python and NumPy using Howard policy iteration. The entire quote ladder — all sizes, all inventory levels, bid and ask — is solved jointly and can be recomputed as market inputs or calibrated flow parameters change.</w:t>
       </w:r>
     </w:p>
     <w:p>

</xml_diff>